<commit_message>
knowleddge 7/3/2026 part 6
</commit_message>
<xml_diff>
--- a/Knowledge/3-Work knowledge/1-Software Engineering/2-General Technologies/9-Databases/5-My Source/2-SQL/1-Intro to SQL/7-SQL commands.docx
+++ b/Knowledge/3-Work knowledge/1-Software Engineering/2-General Technologies/9-Databases/5-My Source/2-SQL/1-Intro to SQL/7-SQL commands.docx
@@ -4773,17 +4773,6 @@
         </w:pict>
       </w:r>
     </w:p>
-    <w:p>
-      <w:pPr>
-        <w:spacing w:before="240" w:after="240"/>
-      </w:pPr>
-      <w:r>
-        <w:rPr>
-          <w:rFonts w:ascii="Roboto Mono" w:eastAsia="Roboto Mono" w:hAnsi="Roboto Mono"/>
-        </w:rPr>
-        <w:t>Let me know if you want examples of each with real table data!</w:t>
-      </w:r>
-    </w:p>
     <w:p/>
     <w:p>
       <w:pPr>
@@ -5377,7 +5366,6 @@
           <w:sz w:val="26"/>
           <w:szCs w:val="26"/>
         </w:rPr>
-        <w:lastRenderedPageBreak/>
         <w:t>✅ 2. DML – Learn how to modify data</w:t>
       </w:r>
     </w:p>
@@ -5858,7 +5846,6 @@
           <w:sz w:val="18"/>
           <w:highlight w:val="lightGray"/>
         </w:rPr>
-        <w:lastRenderedPageBreak/>
         <w:t># Source: AI Source: Provided by: [Data Path</w:t>
       </w:r>
       <w:r>
@@ -6511,7 +6498,6 @@
           <w:sz w:val="26"/>
           <w:szCs w:val="26"/>
         </w:rPr>
-        <w:lastRenderedPageBreak/>
         <w:t>✅ Summary Order to Learn:</w:t>
       </w:r>
     </w:p>
@@ -9602,6 +9588,7 @@
   <w:style w:type="character" w:default="1" w:styleId="DefaultParagraphFont">
     <w:name w:val="Default Paragraph Font"/>
     <w:uiPriority w:val="1"/>
+    <w:semiHidden/>
     <w:unhideWhenUsed/>
   </w:style>
   <w:style w:type="table" w:default="1" w:styleId="TableNormal">

</xml_diff>